<commit_message>
Add GitHub access setup section to the prompt template (md and docx)
Co-Authored-By: Claude Sonnet 5.5 <noreply@anthropic.com>
Claude-Session: https://claude.ai/code/session_01LpYZK8PSXtTsfpZaCtTLVU
</commit_message>
<xml_diff>
--- a/xgimi-video/PROMPT_TEMPLATE.docx
+++ b/xgimi-video/PROMPT_TEMPLATE.docx
@@ -12,6 +12,396 @@
           <w:rFonts w:ascii="Calibri" w:cs="Calibri" w:eastAsia="Calibri" w:hAnsi="Calibri"/>
         </w:rPr>
         <w:t xml:space="preserve">Modèle de prompt : vidéos promotionnelles horizontale et verticale</w:t>
+      </w:r>
+    </w:p>
+    <w:p>
+      <w:pPr>
+        <w:pStyle w:val="Heading2"/>
+        <w:spacing w:after="120" w:before="240"/>
+      </w:pPr>
+      <w:r>
+        <w:rPr>
+          <w:rFonts w:ascii="Calibri" w:cs="Calibri" w:eastAsia="Calibri" w:hAnsi="Calibri"/>
+        </w:rPr>
+        <w:t xml:space="preserve">Avant de commencer : régler l'accès GitHub (une seule fois)</w:t>
+      </w:r>
+    </w:p>
+    <w:p>
+      <w:pPr>
+        <w:pStyle w:val="Heading3"/>
+        <w:spacing w:after="80" w:before="200"/>
+      </w:pPr>
+      <w:r>
+        <w:rPr>
+          <w:rFonts w:ascii="Calibri" w:cs="Calibri" w:eastAsia="Calibri" w:hAnsi="Calibri"/>
+        </w:rPr>
+        <w:t xml:space="preserve">1) Connecter votre compte GitHub à Claude</w:t>
+      </w:r>
+    </w:p>
+    <w:p>
+      <w:pPr>
+        <w:pStyle w:val="ListParagraph"/>
+        <w:numPr>
+          <w:ilvl w:val="0"/>
+          <w:numId w:val="2"/>
+        </w:numPr>
+        <w:spacing w:after="80"/>
+      </w:pPr>
+      <w:r>
+        <w:rPr>
+          <w:rFonts w:ascii="Calibri" w:cs="Calibri" w:eastAsia="Calibri" w:hAnsi="Calibri"/>
+          <w:sz w:val="22"/>
+          <w:szCs w:val="22"/>
+        </w:rPr>
+        <w:t xml:space="preserve">Ouvrez https://claude.ai/connect-github et cliquez sur Connect (ou Reconnect).</w:t>
+      </w:r>
+    </w:p>
+    <w:p>
+      <w:pPr>
+        <w:pStyle w:val="ListParagraph"/>
+        <w:numPr>
+          <w:ilvl w:val="0"/>
+          <w:numId w:val="2"/>
+        </w:numPr>
+        <w:spacing w:after="80"/>
+      </w:pPr>
+      <w:r>
+        <w:rPr>
+          <w:rFonts w:ascii="Calibri" w:cs="Calibri" w:eastAsia="Calibri" w:hAnsi="Calibri"/>
+          <w:sz w:val="22"/>
+          <w:szCs w:val="22"/>
+        </w:rPr>
+        <w:t xml:space="preserve">Acceptez les autorisations demandées.</w:t>
+      </w:r>
+    </w:p>
+    <w:p>
+      <w:pPr>
+        <w:spacing w:after="120"/>
+      </w:pPr>
+      <w:r>
+        <w:rPr>
+          <w:rFonts w:ascii="Calibri" w:cs="Calibri" w:eastAsia="Calibri" w:hAnsi="Calibri"/>
+          <w:sz w:val="22"/>
+          <w:szCs w:val="22"/>
+        </w:rPr>
+        <w:t xml:space="preserve">C'est bon quand la page des connecteurs de Claude affiche « Compte GitHub connecté » en vert.</w:t>
+      </w:r>
+    </w:p>
+    <w:p>
+      <w:pPr>
+        <w:pStyle w:val="Heading3"/>
+        <w:spacing w:after="80" w:before="200"/>
+      </w:pPr>
+      <w:r>
+        <w:rPr>
+          <w:rFonts w:ascii="Calibri" w:cs="Calibri" w:eastAsia="Calibri" w:hAnsi="Calibri"/>
+        </w:rPr>
+        <w:t xml:space="preserve">2) Installer l'app Claude GitHub sur le bon dépôt</w:t>
+      </w:r>
+    </w:p>
+    <w:p>
+      <w:pPr>
+        <w:spacing w:after="120"/>
+      </w:pPr>
+      <w:r>
+        <w:rPr>
+          <w:rFonts w:ascii="Calibri" w:cs="Calibri" w:eastAsia="Calibri" w:hAnsi="Calibri"/>
+          <w:sz w:val="22"/>
+          <w:szCs w:val="22"/>
+        </w:rPr>
+        <w:t xml:space="preserve">Le compte connecté ne suffit pas : l'app doit aussi être autorisée sur le dépôt.</w:t>
+      </w:r>
+    </w:p>
+    <w:p>
+      <w:pPr>
+        <w:pStyle w:val="ListParagraph"/>
+        <w:numPr>
+          <w:ilvl w:val="0"/>
+          <w:numId w:val="3"/>
+        </w:numPr>
+        <w:spacing w:after="80"/>
+      </w:pPr>
+      <w:r>
+        <w:rPr>
+          <w:rFonts w:ascii="Calibri" w:cs="Calibri" w:eastAsia="Calibri" w:hAnsi="Calibri"/>
+          <w:sz w:val="22"/>
+          <w:szCs w:val="22"/>
+        </w:rPr>
+        <w:t xml:space="preserve">Ouvrez https://github.com/apps/claude/installations/select_target.</w:t>
+      </w:r>
+    </w:p>
+    <w:p>
+      <w:pPr>
+        <w:pStyle w:val="ListParagraph"/>
+        <w:numPr>
+          <w:ilvl w:val="0"/>
+          <w:numId w:val="3"/>
+        </w:numPr>
+        <w:spacing w:after="80"/>
+      </w:pPr>
+      <w:r>
+        <w:rPr>
+          <w:rFonts w:ascii="Calibri" w:cs="Calibri" w:eastAsia="Calibri" w:hAnsi="Calibri"/>
+          <w:sz w:val="22"/>
+          <w:szCs w:val="22"/>
+        </w:rPr>
+        <w:t xml:space="preserve">Choisissez votre compte.</w:t>
+      </w:r>
+    </w:p>
+    <w:p>
+      <w:pPr>
+        <w:pStyle w:val="ListParagraph"/>
+        <w:numPr>
+          <w:ilvl w:val="0"/>
+          <w:numId w:val="3"/>
+        </w:numPr>
+        <w:spacing w:after="80"/>
+      </w:pPr>
+      <w:r>
+        <w:rPr>
+          <w:rFonts w:ascii="Calibri" w:cs="Calibri" w:eastAsia="Calibri" w:hAnsi="Calibri"/>
+          <w:sz w:val="22"/>
+          <w:szCs w:val="22"/>
+        </w:rPr>
+        <w:t xml:space="preserve">Dans « Repository access », choisissez Only select repositories, puis cochez le dépôt voulu.</w:t>
+      </w:r>
+    </w:p>
+    <w:p>
+      <w:pPr>
+        <w:pStyle w:val="ListParagraph"/>
+        <w:numPr>
+          <w:ilvl w:val="0"/>
+          <w:numId w:val="3"/>
+        </w:numPr>
+        <w:spacing w:after="80"/>
+      </w:pPr>
+      <w:r>
+        <w:rPr>
+          <w:rFonts w:ascii="Calibri" w:cs="Calibri" w:eastAsia="Calibri" w:hAnsi="Calibri"/>
+          <w:sz w:val="22"/>
+          <w:szCs w:val="22"/>
+        </w:rPr>
+        <w:t xml:space="preserve">Cliquez sur Install (ou Save si l'app est déjà installée).</w:t>
+      </w:r>
+    </w:p>
+    <w:p>
+      <w:pPr>
+        <w:spacing w:after="120"/>
+      </w:pPr>
+      <w:r>
+        <w:rPr>
+          <w:rFonts w:ascii="Calibri" w:cs="Calibri" w:eastAsia="Calibri" w:hAnsi="Calibri"/>
+          <w:sz w:val="22"/>
+          <w:szCs w:val="22"/>
+        </w:rPr>
+        <w:t xml:space="preserve">À chaque nouveau dépôt, revenez ajouter ce dépôt à la liste de l'app.</w:t>
+      </w:r>
+    </w:p>
+    <w:p>
+      <w:pPr>
+        <w:pStyle w:val="Heading3"/>
+        <w:spacing w:after="80" w:before="200"/>
+      </w:pPr>
+      <w:r>
+        <w:rPr>
+          <w:rFonts w:ascii="Calibri" w:cs="Calibri" w:eastAsia="Calibri" w:hAnsi="Calibri"/>
+        </w:rPr>
+        <w:t xml:space="preserve">3) Vérifier avant de commencer</w:t>
+      </w:r>
+    </w:p>
+    <w:p>
+      <w:pPr>
+        <w:pStyle w:val="ListParagraph"/>
+        <w:numPr>
+          <w:ilvl w:val="0"/>
+          <w:numId w:val="4"/>
+        </w:numPr>
+        <w:spacing w:after="80"/>
+      </w:pPr>
+      <w:r>
+        <w:rPr>
+          <w:rFonts w:ascii="Calibri" w:cs="Calibri" w:eastAsia="Calibri" w:hAnsi="Calibri"/>
+          <w:sz w:val="22"/>
+          <w:szCs w:val="22"/>
+        </w:rPr>
+        <w:t xml:space="preserve">Sur https://github.com/settings/installations, Claude doit apparaître, avec votre dépôt dans ses dépôts autorisés.</w:t>
+      </w:r>
+    </w:p>
+    <w:p>
+      <w:pPr>
+        <w:pStyle w:val="ListParagraph"/>
+        <w:numPr>
+          <w:ilvl w:val="0"/>
+          <w:numId w:val="4"/>
+        </w:numPr>
+        <w:spacing w:after="80"/>
+      </w:pPr>
+      <w:r>
+        <w:rPr>
+          <w:rFonts w:ascii="Calibri" w:cs="Calibri" w:eastAsia="Calibri" w:hAnsi="Calibri"/>
+          <w:sz w:val="22"/>
+          <w:szCs w:val="22"/>
+        </w:rPr>
+        <w:t xml:space="preserve">Sur la page des connecteurs de Claude, « Application Claude GitHub » doit afficher votre compte avec la mention « Installé ».</w:t>
+      </w:r>
+    </w:p>
+    <w:p>
+      <w:pPr>
+        <w:pStyle w:val="Heading3"/>
+        <w:spacing w:after="80" w:before="200"/>
+      </w:pPr>
+      <w:r>
+        <w:rPr>
+          <w:rFonts w:ascii="Calibri" w:cs="Calibri" w:eastAsia="Calibri" w:hAnsi="Calibri"/>
+        </w:rPr>
+        <w:t xml:space="preserve">4) Démarrer la session sur le bon dépôt</w:t>
+      </w:r>
+    </w:p>
+    <w:p>
+      <w:pPr>
+        <w:pStyle w:val="ListParagraph"/>
+        <w:numPr>
+          <w:ilvl w:val="0"/>
+          <w:numId w:val="5"/>
+        </w:numPr>
+        <w:spacing w:after="80"/>
+      </w:pPr>
+      <w:r>
+        <w:rPr>
+          <w:rFonts w:ascii="Calibri" w:cs="Calibri" w:eastAsia="Calibri" w:hAnsi="Calibri"/>
+          <w:sz w:val="22"/>
+          <w:szCs w:val="22"/>
+        </w:rPr>
+        <w:t xml:space="preserve">Dans Claude Code, créez une nouvelle session en sélectionnant le dépôt dans la liste.</w:t>
+      </w:r>
+    </w:p>
+    <w:p>
+      <w:pPr>
+        <w:pStyle w:val="ListParagraph"/>
+        <w:numPr>
+          <w:ilvl w:val="0"/>
+          <w:numId w:val="5"/>
+        </w:numPr>
+        <w:spacing w:after="80"/>
+      </w:pPr>
+      <w:r>
+        <w:rPr>
+          <w:rFonts w:ascii="Calibri" w:cs="Calibri" w:eastAsia="Calibri" w:hAnsi="Calibri"/>
+          <w:sz w:val="22"/>
+          <w:szCs w:val="22"/>
+        </w:rPr>
+        <w:t xml:space="preserve">Le dépôt est attaché au démarrage. Si vous changez l'accès pendant une session, cela peut fonctionner tout de suite. Si le push est refusé malgré tout, ouvrez une nouvelle session.</w:t>
+      </w:r>
+    </w:p>
+    <w:p>
+      <w:pPr>
+        <w:pStyle w:val="Heading3"/>
+        <w:spacing w:after="80" w:before="200"/>
+      </w:pPr>
+      <w:r>
+        <w:rPr>
+          <w:rFonts w:ascii="Calibri" w:cs="Calibri" w:eastAsia="Calibri" w:hAnsi="Calibri"/>
+        </w:rPr>
+        <w:t xml:space="preserve">Si le push échoue (erreur 403)</w:t>
+      </w:r>
+    </w:p>
+    <w:p>
+      <w:pPr>
+        <w:spacing w:after="120"/>
+      </w:pPr>
+      <w:r>
+        <w:rPr>
+          <w:rFonts w:ascii="Calibri" w:cs="Calibri" w:eastAsia="Calibri" w:hAnsi="Calibri"/>
+          <w:sz w:val="22"/>
+          <w:szCs w:val="22"/>
+        </w:rPr>
+        <w:t xml:space="preserve">Le message dit « Claude doesn't have GitHub access ». Reprenez dans l'ordre : l'étape 2, puis l'étape 1, puis une nouvelle session.</w:t>
+      </w:r>
+    </w:p>
+    <w:p>
+      <w:pPr>
+        <w:pStyle w:val="Heading3"/>
+        <w:spacing w:after="80" w:before="200"/>
+      </w:pPr>
+      <w:r>
+        <w:rPr>
+          <w:rFonts w:ascii="Calibri" w:cs="Calibri" w:eastAsia="Calibri" w:hAnsi="Calibri"/>
+        </w:rPr>
+        <w:t xml:space="preserve">Bon à savoir</w:t>
+      </w:r>
+    </w:p>
+    <w:p>
+      <w:pPr>
+        <w:pStyle w:val="ListParagraph"/>
+        <w:numPr>
+          <w:ilvl w:val="0"/>
+          <w:numId w:val="4"/>
+        </w:numPr>
+        <w:spacing w:after="80"/>
+      </w:pPr>
+      <w:r>
+        <w:rPr>
+          <w:rFonts w:ascii="Calibri" w:cs="Calibri" w:eastAsia="Calibri" w:hAnsi="Calibri"/>
+          <w:b/>
+          <w:bCs/>
+          <w:sz w:val="22"/>
+          <w:szCs w:val="22"/>
+        </w:rPr>
+        <w:t xml:space="preserve">Dépôt privé ou public : </w:t>
+      </w:r>
+      <w:r>
+        <w:rPr>
+          <w:rFonts w:ascii="Calibri" w:cs="Calibri" w:eastAsia="Calibri" w:hAnsi="Calibri"/>
+          <w:sz w:val="22"/>
+          <w:szCs w:val="22"/>
+        </w:rPr>
+        <w:t xml:space="preserve">si les vidéos ne doivent pas être visibles par tous, créez un dépôt privé avant l'étape 2.</w:t>
+      </w:r>
+    </w:p>
+    <w:p>
+      <w:pPr>
+        <w:pStyle w:val="ListParagraph"/>
+        <w:numPr>
+          <w:ilvl w:val="0"/>
+          <w:numId w:val="4"/>
+        </w:numPr>
+        <w:spacing w:after="80"/>
+      </w:pPr>
+      <w:r>
+        <w:rPr>
+          <w:rFonts w:ascii="Calibri" w:cs="Calibri" w:eastAsia="Calibri" w:hAnsi="Calibri"/>
+          <w:b/>
+          <w:bCs/>
+          <w:sz w:val="22"/>
+          <w:szCs w:val="22"/>
+        </w:rPr>
+        <w:t xml:space="preserve">Dépôt d'une organisation : </w:t>
+      </w:r>
+      <w:r>
+        <w:rPr>
+          <w:rFonts w:ascii="Calibri" w:cs="Calibri" w:eastAsia="Calibri" w:hAnsi="Calibri"/>
+          <w:sz w:val="22"/>
+          <w:szCs w:val="22"/>
+        </w:rPr>
+        <w:t xml:space="preserve">un propriétaire de l'organisation doit installer l'app.</w:t>
+      </w:r>
+    </w:p>
+    <w:p>
+      <w:pPr>
+        <w:pStyle w:val="ListParagraph"/>
+        <w:numPr>
+          <w:ilvl w:val="0"/>
+          <w:numId w:val="4"/>
+        </w:numPr>
+        <w:spacing w:after="80"/>
+      </w:pPr>
+      <w:r>
+        <w:rPr>
+          <w:rFonts w:ascii="Calibri" w:cs="Calibri" w:eastAsia="Calibri" w:hAnsi="Calibri"/>
+          <w:sz w:val="22"/>
+          <w:szCs w:val="22"/>
+        </w:rPr>
+        <w:t xml:space="preserve">L'app ne sert qu'aux sessions Claude Code dans le cloud, pas à celles lancées sur votre ordinateur.</w:t>
       </w:r>
     </w:p>
     <w:p>
@@ -1266,7 +1656,7 @@
         <w:pStyle w:val="ListParagraph"/>
         <w:numPr>
           <w:ilvl w:val="0"/>
-          <w:numId w:val="2"/>
+          <w:numId w:val="4"/>
         </w:numPr>
         <w:spacing w:after="80"/>
       </w:pPr>
@@ -1284,7 +1674,7 @@
         <w:pStyle w:val="ListParagraph"/>
         <w:numPr>
           <w:ilvl w:val="0"/>
-          <w:numId w:val="2"/>
+          <w:numId w:val="4"/>
         </w:numPr>
         <w:spacing w:after="80"/>
       </w:pPr>
@@ -1302,7 +1692,7 @@
         <w:pStyle w:val="ListParagraph"/>
         <w:numPr>
           <w:ilvl w:val="0"/>
-          <w:numId w:val="2"/>
+          <w:numId w:val="4"/>
         </w:numPr>
         <w:spacing w:after="80"/>
       </w:pPr>
@@ -1332,7 +1722,7 @@
         <w:pStyle w:val="ListParagraph"/>
         <w:numPr>
           <w:ilvl w:val="0"/>
-          <w:numId w:val="2"/>
+          <w:numId w:val="4"/>
         </w:numPr>
         <w:spacing w:after="80"/>
       </w:pPr>
@@ -1350,7 +1740,7 @@
         <w:pStyle w:val="ListParagraph"/>
         <w:numPr>
           <w:ilvl w:val="0"/>
-          <w:numId w:val="2"/>
+          <w:numId w:val="4"/>
         </w:numPr>
         <w:spacing w:after="80"/>
       </w:pPr>
@@ -1368,7 +1758,7 @@
         <w:pStyle w:val="ListParagraph"/>
         <w:numPr>
           <w:ilvl w:val="0"/>
-          <w:numId w:val="2"/>
+          <w:numId w:val="4"/>
         </w:numPr>
         <w:spacing w:after="80"/>
       </w:pPr>
@@ -1592,6 +1982,54 @@
       </w:pPr>
     </w:lvl>
   </w:abstractNum>
+  <w:abstractNum w:abstractNumId="3" w15:restartNumberingAfterBreak="0">
+    <w:multiLevelType w:val="hybridMultilevel"/>
+    <w:lvl w:ilvl="0" w15:tentative="1">
+      <w:start w:val="1"/>
+      <w:numFmt w:val="decimal"/>
+      <w:lvlText w:val="%1."/>
+      <w:lvlJc w:val="left"/>
+      <w:pPr>
+        <w:ind w:left="720" w:hanging="360"/>
+      </w:pPr>
+    </w:lvl>
+  </w:abstractNum>
+  <w:abstractNum w:abstractNumId="4" w15:restartNumberingAfterBreak="0">
+    <w:multiLevelType w:val="hybridMultilevel"/>
+    <w:lvl w:ilvl="0" w15:tentative="1">
+      <w:start w:val="1"/>
+      <w:numFmt w:val="decimal"/>
+      <w:lvlText w:val="%1."/>
+      <w:lvlJc w:val="left"/>
+      <w:pPr>
+        <w:ind w:left="720" w:hanging="360"/>
+      </w:pPr>
+    </w:lvl>
+  </w:abstractNum>
+  <w:abstractNum w:abstractNumId="5" w15:restartNumberingAfterBreak="0">
+    <w:multiLevelType w:val="hybridMultilevel"/>
+    <w:lvl w:ilvl="0" w15:tentative="1">
+      <w:start w:val="1"/>
+      <w:numFmt w:val="decimal"/>
+      <w:lvlText w:val="%1."/>
+      <w:lvlJc w:val="left"/>
+      <w:pPr>
+        <w:ind w:left="720" w:hanging="360"/>
+      </w:pPr>
+    </w:lvl>
+  </w:abstractNum>
+  <w:abstractNum w:abstractNumId="6" w15:restartNumberingAfterBreak="0">
+    <w:multiLevelType w:val="hybridMultilevel"/>
+    <w:lvl w:ilvl="0" w15:tentative="1">
+      <w:start w:val="1"/>
+      <w:numFmt w:val="decimal"/>
+      <w:lvlText w:val="%1."/>
+      <w:lvlJc w:val="left"/>
+      <w:pPr>
+        <w:ind w:left="720" w:hanging="360"/>
+      </w:pPr>
+    </w:lvl>
+  </w:abstractNum>
   <w:num w:numId="1">
     <w:abstractNumId w:val="1"/>
     <w:lvlOverride w:ilvl="0">
@@ -1599,7 +2037,25 @@
     </w:lvlOverride>
   </w:num>
   <w:num w:numId="2">
+    <w:abstractNumId w:val="3"/>
+    <w:lvlOverride w:ilvl="0">
+      <w:startOverride w:val="1"/>
+    </w:lvlOverride>
+  </w:num>
+  <w:num w:numId="3">
+    <w:abstractNumId w:val="4"/>
+    <w:lvlOverride w:ilvl="0">
+      <w:startOverride w:val="1"/>
+    </w:lvlOverride>
+  </w:num>
+  <w:num w:numId="4">
     <w:abstractNumId w:val="2"/>
+    <w:lvlOverride w:ilvl="0">
+      <w:startOverride w:val="1"/>
+    </w:lvlOverride>
+  </w:num>
+  <w:num w:numId="5">
+    <w:abstractNumId w:val="5"/>
     <w:lvlOverride w:ilvl="0">
       <w:startOverride w:val="1"/>
     </w:lvlOverride>
@@ -1808,6 +2264,24 @@
       <w:szCs w:val="34"/>
     </w:rPr>
   </w:style>
+  <w:style w:type="paragraph" w:styleId="Heading3">
+    <w:name w:val="Heading 3"/>
+    <w:basedOn w:val="Normal"/>
+    <w:next w:val="Normal"/>
+    <w:qFormat/>
+    <w:pPr>
+      <w:spacing w:after="80" w:before="200"/>
+      <w:outlineLvl w:val="2"/>
+    </w:pPr>
+    <w:rPr>
+      <w:rFonts w:ascii="Calibri" w:cs="Calibri" w:eastAsia="Calibri" w:hAnsi="Calibri"/>
+      <w:b/>
+      <w:bCs/>
+      <w:color w:val="1F3A5F"/>
+      <w:sz w:val="23"/>
+      <w:szCs w:val="23"/>
+    </w:rPr>
+  </w:style>
   <w:style w:type="paragraph" w:styleId="Heading2">
     <w:name w:val="Heading 2"/>
     <w:basedOn w:val="Normal"/>

</xml_diff>